<commit_message>
Le numéro de page seul, à droite, sur les déclarations
Les deux déclarations de confidentialité portaient « Page 1 sur 2 », centré, en
9 points. Les vingt-huit autres pieds de page de la maison portent le numéro
seul, aligné à droite, et les déclarations s'y rangent.

Co-Authored-By: Claude Opus 5 (1M context) <noreply@anthropic.com>
Claude-Session: https://claude.ai/code/session_01TjY1giKxUf3SFnaM3d2rmt
</commit_message>
<xml_diff>
--- a/templates/comptes-confidentialite-micro.docx
+++ b/templates/comptes-confidentialite-micro.docx
@@ -476,22 +476,16 @@
 <w:ftr xmlns:wpc="http://schemas.microsoft.com/office/word/2010/wordprocessingCanvas" xmlns:mc="http://schemas.openxmlformats.org/markup-compatibility/2006" xmlns:o="urn:schemas-microsoft-com:office:office" xmlns:r="http://schemas.openxmlformats.org/officeDocument/2006/relationships" xmlns:m="http://schemas.openxmlformats.org/officeDocument/2006/math" xmlns:v="urn:schemas-microsoft-com:vml" xmlns:wp14="http://schemas.microsoft.com/office/word/2010/wordprocessingDrawing" xmlns:wp="http://schemas.openxmlformats.org/drawingml/2006/wordprocessingDrawing" xmlns:w10="urn:schemas-microsoft-com:office:word" xmlns:w="http://schemas.openxmlformats.org/wordprocessingml/2006/main" xmlns:w14="http://schemas.microsoft.com/office/word/2010/wordml" xmlns:w15="http://schemas.microsoft.com/office/word/2012/wordml" xmlns:wpg="http://schemas.microsoft.com/office/word/2010/wordprocessingGroup" xmlns:wpi="http://schemas.microsoft.com/office/word/2010/wordprocessingInk" xmlns:wne="http://schemas.microsoft.com/office/word/2006/wordml" xmlns:wps="http://schemas.microsoft.com/office/word/2010/wordprocessingShape">
   <w:p>
     <w:pPr>
-      <w:jc w:val="center"/>
+      <w:jc w:val="right"/>
     </w:pPr>
     <w:r>
       <w:rPr>
         <w:rFonts w:ascii="Garamond" w:cs="Garamond" w:eastAsia="Garamond" w:hAnsi="Garamond"/>
-        <w:sz w:val="18"/>
-        <w:szCs w:val="18"/>
+        <w:sz w:val="16"/>
+        <w:szCs w:val="16"/>
       </w:rPr>
-      <w:t xml:space="preserve">Page </w:t>
       <w:fldChar w:fldCharType="begin"/>
       <w:instrText xml:space="preserve">PAGE</w:instrText>
-      <w:fldChar w:fldCharType="separate"/>
-      <w:fldChar w:fldCharType="end"/>
-      <w:t xml:space="preserve"> sur </w:t>
-      <w:fldChar w:fldCharType="begin"/>
-      <w:instrText xml:space="preserve">NUMPAGES</w:instrText>
       <w:fldChar w:fldCharType="separate"/>
       <w:fldChar w:fldCharType="end"/>
     </w:r>

</xml_diff>